<commit_message>
add files via desktop
</commit_message>
<xml_diff>
--- a/Files_Фаруди И/Validation_Фаруди И.docx
+++ b/Files_Фаруди И/Validation_Фаруди И.docx
@@ -948,7 +948,7 @@
           <w:u w:val="single"/>
           <w14:ligatures w14:val="none"/>
         </w:rPr>
-        <w:t>https://css-validator.org/#validate_by_upload</w:t>
+        <w:t>https://jigsaw.w3.org/css-validator/validator</w:t>
       </w:r>
     </w:p>
     <w:p>
@@ -2843,47 +2843,49 @@
     <w:p>
       <w:pPr>
         <w:pStyle w:val="3"/>
-        <w:rPr>
-          <w:lang w:val="ru-RU"/>
-        </w:rPr>
       </w:pPr>
       <w:bookmarkStart w:id="4" w:name="_Toc216602655"/>
       <w:r>
-        <w:rPr>
-          <w:lang w:val="ru-RU"/>
-        </w:rPr>
         <w:t>1.1.2</w:t>
       </w:r>
       <w:r>
-        <w:rPr>
-          <w:lang w:val="ru-RU"/>
-        </w:rPr>
         <w:t xml:space="preserve"> </w:t>
       </w:r>
-      <w:r>
-        <w:rPr>
-          <w:lang w:val="ru-RU"/>
-        </w:rPr>
+      <w:proofErr w:type="spellStart"/>
+      <w:r>
         <w:t>О</w:t>
       </w:r>
       <w:r>
-        <w:rPr>
-          <w:lang w:val="ru-RU"/>
-        </w:rPr>
         <w:t>шиб</w:t>
       </w:r>
       <w:r>
-        <w:rPr>
-          <w:lang w:val="ru-RU"/>
-        </w:rPr>
         <w:t>ки</w:t>
       </w:r>
       <w:bookmarkEnd w:id="4"/>
-    </w:p>
-    <w:p/>
-    <w:p>
-      <w:r>
-        <w:t xml:space="preserve">Ниже представлены ошибки по данной странице. Показано на рисунке 2. </w:t>
+      <w:proofErr w:type="spellEnd"/>
+    </w:p>
+    <w:p>
+      <w:pPr>
+        <w:rPr>
+          <w:lang w:val="en-US"/>
+        </w:rPr>
+      </w:pPr>
+    </w:p>
+    <w:p>
+      <w:r>
+        <w:t xml:space="preserve">Ниже представлены </w:t>
+      </w:r>
+      <w:r>
+        <w:t xml:space="preserve">ошибки </w:t>
+      </w:r>
+      <w:r>
+        <w:t xml:space="preserve">по данной странице. Показано на рисунке </w:t>
+      </w:r>
+      <w:r>
+        <w:t>2</w:t>
+      </w:r>
+      <w:r>
+        <w:t xml:space="preserve">. </w:t>
       </w:r>
     </w:p>
     <w:p/>
@@ -2942,7 +2944,13 @@
         <w:jc w:val="center"/>
       </w:pPr>
       <w:r>
-        <w:t xml:space="preserve">Рисунок 2 – Ошибки </w:t>
+        <w:t xml:space="preserve">Рисунок 2 – </w:t>
+      </w:r>
+      <w:r>
+        <w:t>Ошибки</w:t>
+      </w:r>
+      <w:r>
+        <w:t xml:space="preserve"> </w:t>
       </w:r>
       <w:r>
         <w:rPr>
@@ -3438,42 +3446,26 @@
     <w:p>
       <w:pPr>
         <w:pStyle w:val="3"/>
-        <w:rPr>
-          <w:lang w:val="ru-RU"/>
-        </w:rPr>
       </w:pPr>
       <w:bookmarkStart w:id="6" w:name="_Toc216602657"/>
       <w:r>
-        <w:rPr>
-          <w:lang w:val="ru-RU"/>
-        </w:rPr>
         <w:t>1.2.1</w:t>
       </w:r>
       <w:r>
-        <w:rPr>
-          <w:lang w:val="ru-RU"/>
-        </w:rPr>
         <w:t xml:space="preserve"> </w:t>
       </w:r>
-      <w:r>
-        <w:rPr>
-          <w:lang w:val="ru-RU"/>
-        </w:rPr>
+      <w:proofErr w:type="spellStart"/>
+      <w:r>
         <w:t>П</w:t>
       </w:r>
       <w:r>
-        <w:rPr>
-          <w:lang w:val="ru-RU"/>
-        </w:rPr>
         <w:t>редупреждени</w:t>
       </w:r>
       <w:r>
-        <w:rPr>
-          <w:lang w:val="ru-RU"/>
-        </w:rPr>
         <w:t>я</w:t>
       </w:r>
       <w:bookmarkEnd w:id="6"/>
+      <w:proofErr w:type="spellEnd"/>
     </w:p>
     <w:p/>
     <w:p>
@@ -4167,48 +4159,29 @@
     <w:p>
       <w:pPr>
         <w:pStyle w:val="3"/>
-        <w:rPr>
-          <w:lang w:val="ru-RU"/>
-        </w:rPr>
       </w:pPr>
       <w:bookmarkStart w:id="8" w:name="_Toc216602659"/>
       <w:r>
-        <w:rPr>
-          <w:lang w:val="ru-RU"/>
-        </w:rPr>
         <w:t>1.</w:t>
       </w:r>
       <w:r>
-        <w:rPr>
-          <w:lang w:val="ru-RU"/>
-        </w:rPr>
         <w:t>3</w:t>
       </w:r>
       <w:r>
-        <w:rPr>
-          <w:lang w:val="ru-RU"/>
-        </w:rPr>
         <w:t xml:space="preserve">.1 </w:t>
       </w:r>
-      <w:r>
-        <w:rPr>
-          <w:lang w:val="ru-RU"/>
-        </w:rPr>
+      <w:proofErr w:type="spellStart"/>
+      <w:r>
         <w:t>О</w:t>
       </w:r>
       <w:r>
-        <w:rPr>
-          <w:lang w:val="ru-RU"/>
-        </w:rPr>
         <w:t>шиб</w:t>
       </w:r>
       <w:r>
-        <w:rPr>
-          <w:lang w:val="ru-RU"/>
-        </w:rPr>
         <w:t>ки</w:t>
       </w:r>
       <w:bookmarkEnd w:id="8"/>
+      <w:proofErr w:type="spellEnd"/>
     </w:p>
     <w:p/>
     <w:p>
@@ -5910,6 +5883,9 @@
     <w:p>
       <w:pPr>
         <w:pStyle w:val="1"/>
+        <w:rPr>
+          <w:lang w:val="en-US"/>
+        </w:rPr>
       </w:pPr>
       <w:bookmarkStart w:id="11" w:name="_Toc216602662"/>
       <w:r>
@@ -5945,10 +5921,22 @@
       </w:r>
       <w:bookmarkEnd w:id="11"/>
     </w:p>
-    <w:p/>
-    <w:p>
-      <w:r>
-        <w:t>Подтверждение полученного результата показано на рисунке 11.</w:t>
+    <w:p>
+      <w:pPr>
+        <w:rPr>
+          <w:lang w:val="en-US"/>
+        </w:rPr>
+      </w:pPr>
+    </w:p>
+    <w:p>
+      <w:r>
+        <w:t>Подтверждение полученного результата показано на рисунке 1</w:t>
+      </w:r>
+      <w:r>
+        <w:t>1</w:t>
+      </w:r>
+      <w:r>
+        <w:t>.</w:t>
       </w:r>
     </w:p>
     <w:p/>

</xml_diff>